<commit_message>
Add Excel workload report generation feature
- Create `TODO/generate_report.php`
- Use PhpSpreadsheet for Excel creation
- Rename template to `template.xlsx`
- Formatted with 2-space indentation and braces on new lines
- Enforce strict permission checks (Uoup, Dean, Head of Department)
- Gather all required properties strictly from db `xml_*` tables
- Join positions and rates dynamically from the `sotrudniki` table
- Increase memory limit to 1G to handle large exports
- Optimize main query to select specific columns instead of l.*
- Support fallback to faculty Code for joining GPH roles

Co-authored-by: dreich <1155080+dreich@users.noreply.github.com>
</commit_message>
<xml_diff>
--- a/TODO/ТЗ по отчету из ЛК ЗК для ИИ.docx
+++ b/TODO/ТЗ по отчету из ЛК ЗК для ИИ.docx
@@ -110,6 +110,7 @@
             <w:pPr>
               <w:pStyle w:val="Normal"/>
               <w:widowControl/>
+              <w:suppressAutoHyphens w:val="true"/>
               <w:spacing w:lineRule="auto" w:line="240" w:before="0" w:after="0"/>
               <w:jc w:val="center"/>
               <w:rPr>
@@ -138,6 +139,7 @@
             <w:pPr>
               <w:pStyle w:val="Normal"/>
               <w:widowControl/>
+              <w:suppressAutoHyphens w:val="true"/>
               <w:spacing w:lineRule="auto" w:line="240" w:before="0" w:after="0"/>
               <w:jc w:val="center"/>
               <w:rPr>
@@ -167,6 +169,7 @@
             <w:pPr>
               <w:pStyle w:val="Normal"/>
               <w:widowControl/>
+              <w:suppressAutoHyphens w:val="true"/>
               <w:spacing w:lineRule="auto" w:line="240" w:before="0" w:after="0"/>
               <w:jc w:val="center"/>
               <w:rPr>
@@ -198,6 +201,7 @@
             <w:pPr>
               <w:pStyle w:val="Normal"/>
               <w:widowControl/>
+              <w:suppressAutoHyphens w:val="true"/>
               <w:spacing w:lineRule="auto" w:line="240" w:before="0" w:after="0"/>
               <w:jc w:val="left"/>
               <w:rPr>
@@ -229,6 +233,7 @@
             <w:pPr>
               <w:pStyle w:val="Normal"/>
               <w:widowControl/>
+              <w:suppressAutoHyphens w:val="true"/>
               <w:spacing w:lineRule="auto" w:line="240" w:before="0" w:after="0"/>
               <w:jc w:val="left"/>
               <w:rPr>
@@ -243,7 +248,7 @@
                 <w:szCs w:val="22"/>
                 <w:lang w:val="ru-RU" w:eastAsia="en-US" w:bidi="ar-SA"/>
               </w:rPr>
-              <w:t>Факультет собственник(аббревиатура)</w:t>
+              <w:t>Факультет собственник (аббревиатура)</w:t>
             </w:r>
           </w:p>
         </w:tc>
@@ -256,6 +261,7 @@
             <w:pPr>
               <w:pStyle w:val="Normal"/>
               <w:widowControl/>
+              <w:suppressAutoHyphens w:val="true"/>
               <w:spacing w:lineRule="auto" w:line="240" w:before="0" w:after="0"/>
               <w:jc w:val="left"/>
               <w:rPr>
@@ -290,6 +296,7 @@
             <w:pPr>
               <w:pStyle w:val="Normal"/>
               <w:widowControl/>
+              <w:suppressAutoHyphens w:val="true"/>
               <w:spacing w:lineRule="auto" w:line="240" w:before="0" w:after="0"/>
               <w:jc w:val="left"/>
               <w:rPr>
@@ -321,6 +328,7 @@
             <w:pPr>
               <w:pStyle w:val="Normal"/>
               <w:widowControl/>
+              <w:suppressAutoHyphens w:val="true"/>
               <w:spacing w:lineRule="auto" w:line="240" w:before="0" w:after="0"/>
               <w:jc w:val="left"/>
               <w:rPr>
@@ -368,6 +376,7 @@
             <w:pPr>
               <w:pStyle w:val="Normal"/>
               <w:widowControl/>
+              <w:suppressAutoHyphens w:val="true"/>
               <w:spacing w:lineRule="auto" w:line="240" w:before="0" w:after="0"/>
               <w:jc w:val="left"/>
               <w:rPr>
@@ -402,6 +411,7 @@
             <w:pPr>
               <w:pStyle w:val="Normal"/>
               <w:widowControl/>
+              <w:suppressAutoHyphens w:val="true"/>
               <w:spacing w:lineRule="auto" w:line="240" w:before="0" w:after="0"/>
               <w:jc w:val="left"/>
               <w:rPr>
@@ -433,6 +443,7 @@
             <w:pPr>
               <w:pStyle w:val="Normal"/>
               <w:widowControl/>
+              <w:suppressAutoHyphens w:val="true"/>
               <w:spacing w:lineRule="auto" w:line="240" w:before="0" w:after="0"/>
               <w:jc w:val="left"/>
               <w:rPr>
@@ -464,6 +475,7 @@
             <w:pPr>
               <w:pStyle w:val="Normal"/>
               <w:widowControl/>
+              <w:suppressAutoHyphens w:val="true"/>
               <w:spacing w:lineRule="auto" w:line="240" w:before="0" w:after="0"/>
               <w:jc w:val="left"/>
               <w:rPr>
@@ -498,6 +510,7 @@
             <w:pPr>
               <w:pStyle w:val="Normal"/>
               <w:widowControl/>
+              <w:suppressAutoHyphens w:val="true"/>
               <w:spacing w:lineRule="auto" w:line="240" w:before="0" w:after="0"/>
               <w:jc w:val="left"/>
               <w:rPr>
@@ -529,6 +542,7 @@
             <w:pPr>
               <w:pStyle w:val="Normal"/>
               <w:widowControl/>
+              <w:suppressAutoHyphens w:val="true"/>
               <w:spacing w:lineRule="auto" w:line="240" w:before="0" w:after="0"/>
               <w:jc w:val="left"/>
               <w:rPr>
@@ -560,31 +574,33 @@
             <w:pPr>
               <w:pStyle w:val="Normal"/>
               <w:widowControl/>
-              <w:spacing w:lineRule="auto" w:line="240" w:before="0" w:after="0"/>
-              <w:jc w:val="left"/>
-              <w:rPr>
-                <w:rFonts w:ascii="Calibri" w:hAnsi="Calibri" w:eastAsia="Calibri" w:cs=""/>
-                <w:kern w:val="0"/>
-                <w:sz w:val="22"/>
-                <w:szCs w:val="22"/>
-                <w:lang w:val="ru-RU" w:eastAsia="en-US" w:bidi="ar-SA"/>
-              </w:rPr>
-            </w:pPr>
-            <w:r>
-              <w:rPr>
-                <w:rFonts w:eastAsia="Calibri" w:cs=""/>
-                <w:kern w:val="0"/>
-                <w:sz w:val="22"/>
-                <w:szCs w:val="22"/>
-                <w:lang w:val="ru-RU" w:eastAsia="en-US" w:bidi="ar-SA"/>
-              </w:rPr>
-              <w:t xml:space="preserve">Столбец Преподаватель (16) . Если преподавателей несколько в одной ячейке, то каждый преподаватель на отдельной строчке, с информацией по дисциплине данной строки. </w:t>
-            </w:r>
-          </w:p>
-          <w:p>
-            <w:pPr>
-              <w:pStyle w:val="Normal"/>
-              <w:widowControl/>
+              <w:suppressAutoHyphens w:val="true"/>
+              <w:spacing w:lineRule="auto" w:line="240" w:before="0" w:after="0"/>
+              <w:jc w:val="left"/>
+              <w:rPr>
+                <w:rFonts w:ascii="Calibri" w:hAnsi="Calibri" w:eastAsia="Calibri" w:cs=""/>
+                <w:kern w:val="0"/>
+                <w:sz w:val="22"/>
+                <w:szCs w:val="22"/>
+                <w:lang w:val="ru-RU" w:eastAsia="en-US" w:bidi="ar-SA"/>
+              </w:rPr>
+            </w:pPr>
+            <w:r>
+              <w:rPr>
+                <w:rFonts w:eastAsia="Calibri" w:cs=""/>
+                <w:kern w:val="0"/>
+                <w:sz w:val="22"/>
+                <w:szCs w:val="22"/>
+                <w:lang w:val="ru-RU" w:eastAsia="en-US" w:bidi="ar-SA"/>
+              </w:rPr>
+              <w:t>Столбец Преподаватель (16). Если преподавателей несколько в одной ячейке, то каждый преподаватель на отдельной строчке, с информацией по дисциплине данной строки.</w:t>
+            </w:r>
+          </w:p>
+          <w:p>
+            <w:pPr>
+              <w:pStyle w:val="Normal"/>
+              <w:widowControl/>
+              <w:suppressAutoHyphens w:val="true"/>
               <w:spacing w:lineRule="auto" w:line="240" w:before="0" w:after="0"/>
               <w:jc w:val="left"/>
               <w:rPr>
@@ -619,6 +635,7 @@
             <w:pPr>
               <w:pStyle w:val="Normal"/>
               <w:widowControl/>
+              <w:suppressAutoHyphens w:val="true"/>
               <w:spacing w:lineRule="auto" w:line="240" w:before="0" w:after="0"/>
               <w:jc w:val="left"/>
               <w:rPr>
@@ -650,6 +667,7 @@
             <w:pPr>
               <w:pStyle w:val="Normal"/>
               <w:widowControl/>
+              <w:suppressAutoHyphens w:val="true"/>
               <w:spacing w:lineRule="auto" w:line="240" w:before="0" w:after="0"/>
               <w:jc w:val="left"/>
               <w:rPr>
@@ -681,6 +699,7 @@
             <w:pPr>
               <w:pStyle w:val="Normal"/>
               <w:widowControl/>
+              <w:suppressAutoHyphens w:val="true"/>
               <w:spacing w:lineRule="auto" w:line="240" w:before="0" w:after="0"/>
               <w:jc w:val="left"/>
               <w:rPr>
@@ -715,6 +734,7 @@
             <w:pPr>
               <w:pStyle w:val="Normal"/>
               <w:widowControl/>
+              <w:suppressAutoHyphens w:val="true"/>
               <w:spacing w:lineRule="auto" w:line="240" w:before="0" w:after="0"/>
               <w:jc w:val="left"/>
               <w:rPr>
@@ -746,6 +766,7 @@
             <w:pPr>
               <w:pStyle w:val="Normal"/>
               <w:widowControl/>
+              <w:suppressAutoHyphens w:val="true"/>
               <w:spacing w:lineRule="auto" w:line="240" w:before="0" w:after="0"/>
               <w:jc w:val="left"/>
               <w:rPr>
@@ -777,6 +798,7 @@
             <w:pPr>
               <w:pStyle w:val="Normal"/>
               <w:widowControl/>
+              <w:suppressAutoHyphens w:val="true"/>
               <w:spacing w:lineRule="auto" w:line="240" w:before="0" w:after="0"/>
               <w:jc w:val="left"/>
               <w:rPr>
@@ -811,6 +833,7 @@
             <w:pPr>
               <w:pStyle w:val="Normal"/>
               <w:widowControl/>
+              <w:suppressAutoHyphens w:val="true"/>
               <w:spacing w:lineRule="auto" w:line="240" w:before="0" w:after="0"/>
               <w:jc w:val="left"/>
               <w:rPr>
@@ -842,6 +865,7 @@
             <w:pPr>
               <w:pStyle w:val="Normal"/>
               <w:widowControl/>
+              <w:suppressAutoHyphens w:val="true"/>
               <w:spacing w:lineRule="auto" w:line="240" w:before="0" w:after="0"/>
               <w:jc w:val="left"/>
               <w:rPr>
@@ -873,6 +897,7 @@
             <w:pPr>
               <w:pStyle w:val="Normal"/>
               <w:widowControl/>
+              <w:suppressAutoHyphens w:val="true"/>
               <w:spacing w:lineRule="auto" w:line="240" w:before="0" w:after="0"/>
               <w:jc w:val="left"/>
               <w:rPr>
@@ -907,6 +932,7 @@
             <w:pPr>
               <w:pStyle w:val="Normal"/>
               <w:widowControl/>
+              <w:suppressAutoHyphens w:val="true"/>
               <w:spacing w:lineRule="auto" w:line="240" w:before="0" w:after="0"/>
               <w:jc w:val="left"/>
               <w:rPr>
@@ -938,6 +964,7 @@
             <w:pPr>
               <w:pStyle w:val="Normal"/>
               <w:widowControl/>
+              <w:suppressAutoHyphens w:val="true"/>
               <w:spacing w:lineRule="auto" w:line="240" w:before="0" w:after="0"/>
               <w:jc w:val="left"/>
               <w:rPr>
@@ -969,6 +996,7 @@
             <w:pPr>
               <w:pStyle w:val="Normal"/>
               <w:widowControl/>
+              <w:suppressAutoHyphens w:val="true"/>
               <w:spacing w:lineRule="auto" w:line="240" w:before="0" w:after="0"/>
               <w:jc w:val="left"/>
               <w:rPr>
@@ -1003,6 +1031,7 @@
             <w:pPr>
               <w:pStyle w:val="Normal"/>
               <w:widowControl/>
+              <w:suppressAutoHyphens w:val="true"/>
               <w:spacing w:lineRule="auto" w:line="240" w:before="0" w:after="0"/>
               <w:jc w:val="left"/>
               <w:rPr>
@@ -1034,6 +1063,7 @@
             <w:pPr>
               <w:pStyle w:val="Normal"/>
               <w:widowControl/>
+              <w:suppressAutoHyphens w:val="true"/>
               <w:spacing w:lineRule="auto" w:line="240" w:before="0" w:after="0"/>
               <w:jc w:val="left"/>
               <w:rPr>
@@ -1065,6 +1095,7 @@
             <w:pPr>
               <w:pStyle w:val="Normal"/>
               <w:widowControl/>
+              <w:suppressAutoHyphens w:val="true"/>
               <w:spacing w:lineRule="auto" w:line="240" w:before="0" w:after="0"/>
               <w:jc w:val="left"/>
               <w:rPr>
@@ -1099,6 +1130,7 @@
             <w:pPr>
               <w:pStyle w:val="Normal"/>
               <w:widowControl/>
+              <w:suppressAutoHyphens w:val="true"/>
               <w:spacing w:lineRule="auto" w:line="240" w:before="0" w:after="0"/>
               <w:jc w:val="left"/>
               <w:rPr>
@@ -1130,6 +1162,7 @@
             <w:pPr>
               <w:pStyle w:val="Normal"/>
               <w:widowControl/>
+              <w:suppressAutoHyphens w:val="true"/>
               <w:spacing w:lineRule="auto" w:line="240" w:before="0" w:after="0"/>
               <w:jc w:val="left"/>
               <w:rPr>
@@ -1161,6 +1194,7 @@
             <w:pPr>
               <w:pStyle w:val="Normal"/>
               <w:widowControl/>
+              <w:suppressAutoHyphens w:val="true"/>
               <w:spacing w:lineRule="auto" w:line="240" w:before="0" w:after="0"/>
               <w:jc w:val="left"/>
               <w:rPr>
@@ -1195,6 +1229,7 @@
             <w:pPr>
               <w:pStyle w:val="Normal"/>
               <w:widowControl/>
+              <w:suppressAutoHyphens w:val="true"/>
               <w:spacing w:lineRule="auto" w:line="240" w:before="0" w:after="0"/>
               <w:jc w:val="left"/>
               <w:rPr>
@@ -1226,6 +1261,7 @@
             <w:pPr>
               <w:pStyle w:val="Normal"/>
               <w:widowControl/>
+              <w:suppressAutoHyphens w:val="true"/>
               <w:spacing w:lineRule="auto" w:line="240" w:before="0" w:after="0"/>
               <w:jc w:val="left"/>
               <w:rPr>
@@ -1257,6 +1293,7 @@
             <w:pPr>
               <w:pStyle w:val="Normal"/>
               <w:widowControl/>
+              <w:suppressAutoHyphens w:val="true"/>
               <w:spacing w:lineRule="auto" w:line="240" w:before="0" w:after="0"/>
               <w:jc w:val="left"/>
               <w:rPr>
@@ -1291,6 +1328,7 @@
             <w:pPr>
               <w:pStyle w:val="Normal"/>
               <w:widowControl/>
+              <w:suppressAutoHyphens w:val="true"/>
               <w:spacing w:lineRule="auto" w:line="240" w:before="0" w:after="0"/>
               <w:jc w:val="left"/>
               <w:rPr>
@@ -1322,6 +1360,7 @@
             <w:pPr>
               <w:pStyle w:val="Normal"/>
               <w:widowControl/>
+              <w:suppressAutoHyphens w:val="true"/>
               <w:spacing w:lineRule="auto" w:line="240" w:before="0" w:after="0"/>
               <w:jc w:val="left"/>
               <w:rPr>
@@ -1353,6 +1392,7 @@
             <w:pPr>
               <w:pStyle w:val="Normal"/>
               <w:widowControl/>
+              <w:suppressAutoHyphens w:val="true"/>
               <w:spacing w:lineRule="auto" w:line="240" w:before="0" w:after="0"/>
               <w:jc w:val="left"/>
               <w:rPr>
@@ -1387,6 +1427,7 @@
             <w:pPr>
               <w:pStyle w:val="Normal"/>
               <w:widowControl/>
+              <w:suppressAutoHyphens w:val="true"/>
               <w:spacing w:lineRule="auto" w:line="240" w:before="0" w:after="0"/>
               <w:jc w:val="left"/>
               <w:rPr>
@@ -1418,6 +1459,7 @@
             <w:pPr>
               <w:pStyle w:val="Normal"/>
               <w:widowControl/>
+              <w:suppressAutoHyphens w:val="true"/>
               <w:spacing w:lineRule="auto" w:line="240" w:before="0" w:after="0"/>
               <w:jc w:val="left"/>
               <w:rPr>
@@ -1449,6 +1491,7 @@
             <w:pPr>
               <w:pStyle w:val="Normal"/>
               <w:widowControl/>
+              <w:suppressAutoHyphens w:val="true"/>
               <w:spacing w:lineRule="auto" w:line="240" w:before="0" w:after="0"/>
               <w:jc w:val="left"/>
               <w:rPr>
@@ -1483,6 +1526,7 @@
             <w:pPr>
               <w:pStyle w:val="Normal"/>
               <w:widowControl/>
+              <w:suppressAutoHyphens w:val="true"/>
               <w:spacing w:lineRule="auto" w:line="240" w:before="0" w:after="0"/>
               <w:jc w:val="left"/>
               <w:rPr>
@@ -1514,6 +1558,7 @@
             <w:pPr>
               <w:pStyle w:val="Normal"/>
               <w:widowControl/>
+              <w:suppressAutoHyphens w:val="true"/>
               <w:spacing w:lineRule="auto" w:line="240" w:before="0" w:after="0"/>
               <w:jc w:val="left"/>
               <w:rPr>
@@ -1545,6 +1590,7 @@
             <w:pPr>
               <w:pStyle w:val="Normal"/>
               <w:widowControl/>
+              <w:suppressAutoHyphens w:val="true"/>
               <w:spacing w:lineRule="auto" w:line="240" w:before="0" w:after="0"/>
               <w:jc w:val="left"/>
               <w:rPr>
@@ -1579,6 +1625,7 @@
             <w:pPr>
               <w:pStyle w:val="Normal"/>
               <w:widowControl/>
+              <w:suppressAutoHyphens w:val="true"/>
               <w:spacing w:lineRule="auto" w:line="240" w:before="0" w:after="0"/>
               <w:jc w:val="left"/>
               <w:rPr>
@@ -1610,6 +1657,7 @@
             <w:pPr>
               <w:pStyle w:val="Normal"/>
               <w:widowControl/>
+              <w:suppressAutoHyphens w:val="true"/>
               <w:spacing w:lineRule="auto" w:line="240" w:before="0" w:after="0"/>
               <w:jc w:val="left"/>
               <w:rPr>
@@ -1641,6 +1689,7 @@
             <w:pPr>
               <w:pStyle w:val="Normal"/>
               <w:widowControl/>
+              <w:suppressAutoHyphens w:val="true"/>
               <w:spacing w:lineRule="auto" w:line="240" w:before="0" w:after="0"/>
               <w:jc w:val="left"/>
               <w:rPr>
@@ -1675,6 +1724,7 @@
             <w:pPr>
               <w:pStyle w:val="Normal"/>
               <w:widowControl/>
+              <w:suppressAutoHyphens w:val="true"/>
               <w:spacing w:lineRule="auto" w:line="240" w:before="0" w:after="0"/>
               <w:jc w:val="left"/>
               <w:rPr>
@@ -1706,6 +1756,7 @@
             <w:pPr>
               <w:pStyle w:val="Normal"/>
               <w:widowControl/>
+              <w:suppressAutoHyphens w:val="true"/>
               <w:spacing w:lineRule="auto" w:line="240" w:before="0" w:after="0"/>
               <w:jc w:val="left"/>
               <w:rPr>
@@ -1737,6 +1788,7 @@
             <w:pPr>
               <w:pStyle w:val="Normal"/>
               <w:widowControl/>
+              <w:suppressAutoHyphens w:val="true"/>
               <w:spacing w:lineRule="auto" w:line="240" w:before="0" w:after="0"/>
               <w:jc w:val="left"/>
               <w:rPr>
@@ -1762,6 +1814,7 @@
             <w:pPr>
               <w:pStyle w:val="Normal"/>
               <w:widowControl/>
+              <w:suppressAutoHyphens w:val="true"/>
               <w:spacing w:lineRule="auto" w:line="240" w:before="0" w:after="0"/>
               <w:jc w:val="left"/>
               <w:rPr>
@@ -1790,13 +1843,14 @@
                 <w:szCs w:val="22"/>
                 <w:lang w:val="ru-RU" w:eastAsia="en-US" w:bidi="ar-SA"/>
               </w:rPr>
-              <w:t xml:space="preserve">Должно быть О или В. </w:t>
-            </w:r>
-          </w:p>
-          <w:p>
-            <w:pPr>
-              <w:pStyle w:val="Normal"/>
-              <w:widowControl/>
+              <w:t>Должно быть О или В.</w:t>
+            </w:r>
+          </w:p>
+          <w:p>
+            <w:pPr>
+              <w:pStyle w:val="Normal"/>
+              <w:widowControl/>
+              <w:suppressAutoHyphens w:val="true"/>
               <w:spacing w:lineRule="auto" w:line="240" w:before="0" w:after="0"/>
               <w:jc w:val="left"/>
               <w:rPr>
@@ -1831,6 +1885,7 @@
             <w:pPr>
               <w:pStyle w:val="Normal"/>
               <w:widowControl/>
+              <w:suppressAutoHyphens w:val="true"/>
               <w:spacing w:lineRule="auto" w:line="240" w:before="0" w:after="0"/>
               <w:jc w:val="left"/>
               <w:rPr>
@@ -1862,6 +1917,7 @@
             <w:pPr>
               <w:pStyle w:val="Normal"/>
               <w:widowControl/>
+              <w:suppressAutoHyphens w:val="true"/>
               <w:spacing w:lineRule="auto" w:line="240" w:before="0" w:after="0"/>
               <w:jc w:val="left"/>
               <w:rPr>
@@ -1893,6 +1949,7 @@
             <w:pPr>
               <w:pStyle w:val="Normal"/>
               <w:widowControl/>
+              <w:suppressAutoHyphens w:val="true"/>
               <w:spacing w:lineRule="auto" w:line="240" w:before="0" w:after="0"/>
               <w:jc w:val="left"/>
               <w:rPr>
@@ -1918,6 +1975,7 @@
             <w:pPr>
               <w:pStyle w:val="Normal"/>
               <w:widowControl/>
+              <w:suppressAutoHyphens w:val="true"/>
               <w:spacing w:lineRule="auto" w:line="240" w:before="0" w:after="0"/>
               <w:jc w:val="left"/>
               <w:rPr>
@@ -1952,6 +2010,7 @@
             <w:pPr>
               <w:pStyle w:val="Normal"/>
               <w:widowControl/>
+              <w:suppressAutoHyphens w:val="true"/>
               <w:spacing w:lineRule="auto" w:line="240" w:before="0" w:after="0"/>
               <w:jc w:val="left"/>
               <w:rPr>
@@ -1983,6 +2042,7 @@
             <w:pPr>
               <w:pStyle w:val="Normal"/>
               <w:widowControl/>
+              <w:suppressAutoHyphens w:val="true"/>
               <w:spacing w:lineRule="auto" w:line="240" w:before="0" w:after="0"/>
               <w:jc w:val="left"/>
               <w:rPr>
@@ -2014,6 +2074,7 @@
             <w:pPr>
               <w:pStyle w:val="Normal"/>
               <w:widowControl/>
+              <w:suppressAutoHyphens w:val="true"/>
               <w:spacing w:lineRule="auto" w:line="240" w:before="0" w:after="0"/>
               <w:jc w:val="left"/>
               <w:rPr>
@@ -2039,6 +2100,7 @@
             <w:pPr>
               <w:pStyle w:val="Normal"/>
               <w:widowControl/>
+              <w:suppressAutoHyphens w:val="true"/>
               <w:spacing w:lineRule="auto" w:line="240" w:before="0" w:after="0"/>
               <w:jc w:val="left"/>
               <w:rPr>
@@ -2061,6 +2123,7 @@
             <w:pPr>
               <w:pStyle w:val="Normal"/>
               <w:widowControl/>
+              <w:suppressAutoHyphens w:val="true"/>
               <w:spacing w:lineRule="auto" w:line="240" w:before="0" w:after="0"/>
               <w:jc w:val="left"/>
               <w:rPr>
@@ -2068,13 +2131,7 @@
               </w:rPr>
             </w:pPr>
             <w:r>
-              <w:rPr>
-                <w:rFonts w:eastAsia="Calibri" w:cs=""/>
-                <w:kern w:val="0"/>
-                <w:sz w:val="22"/>
-                <w:szCs w:val="22"/>
-                <w:lang w:val="ru-RU" w:eastAsia="en-US" w:bidi="ar-SA"/>
-              </w:rPr>
+              <w:rPr/>
               <w:object w:dxaOrig="8685" w:dyaOrig="2850">
                 <v:shapetype id="_x0000_tole_rId3" coordsize="21600,21600" o:spt="ole_rId3" o:preferrelative="t" path="m@4@5l@4@11@9@11@9@5xe" filled="f" stroked="f">
                   <v:stroke joinstyle="miter"/>
@@ -2098,35 +2155,25 @@
                 <v:shape id="ole_rId3" type="_x0000_tole_rId3" style="width:319.7pt;height:104.85pt;mso-wrap-distance-right:0pt" filled="f" o:ole="">
                   <v:imagedata r:id="rId4" o:title=""/>
                 </v:shape>
-                <o:OLEObject Type="Embed" ProgID="PBrush" ShapeID="ole_rId3" DrawAspect="Content" ObjectID="_708219028" r:id="rId3"/>
+                <o:OLEObject Type="Embed" ProgID="PBrush" ShapeID="ole_rId3" DrawAspect="Content" ObjectID="_1390886257" r:id="rId3"/>
               </w:object>
             </w:r>
-            <w:r>
-              <w:rPr>
-                <w:rFonts w:eastAsia="Calibri" w:cs=""/>
+          </w:p>
+          <w:p>
+            <w:pPr>
+              <w:pStyle w:val="Normal"/>
+              <w:widowControl/>
+              <w:suppressAutoHyphens w:val="true"/>
+              <w:spacing w:lineRule="auto" w:line="240" w:before="0" w:after="0"/>
+              <w:jc w:val="left"/>
+              <w:rPr>
                 <w:color w:val="FF0000"/>
-                <w:kern w:val="0"/>
-                <w:sz w:val="22"/>
-                <w:szCs w:val="22"/>
-                <w:lang w:val="ru-RU" w:eastAsia="en-US" w:bidi="ar-SA"/>
-              </w:rPr>
-              <w:t xml:space="preserve"> </w:t>
-            </w:r>
-          </w:p>
-          <w:p>
-            <w:pPr>
-              <w:pStyle w:val="Normal"/>
-              <w:widowControl/>
-              <w:spacing w:lineRule="auto" w:line="240" w:before="0" w:after="0"/>
-              <w:jc w:val="left"/>
-              <w:rPr>
+              </w:rPr>
+            </w:pPr>
+            <w:r>
+              <w:rPr>
+                <w:rFonts w:eastAsia="Calibri" w:cs=""/>
                 <w:color w:val="FF0000"/>
-              </w:rPr>
-            </w:pPr>
-            <w:r>
-              <w:rPr>
-                <w:rFonts w:eastAsia="Calibri" w:cs=""/>
-                <w:color w:val="FF0000"/>
                 <w:kern w:val="0"/>
                 <w:sz w:val="22"/>
                 <w:szCs w:val="22"/>
@@ -2139,25 +2186,19 @@
             <w:pPr>
               <w:pStyle w:val="Normal"/>
               <w:widowControl/>
-              <w:spacing w:lineRule="auto" w:line="240" w:before="0" w:after="0"/>
-              <w:jc w:val="left"/>
-              <w:rPr>
-                <w:rFonts w:ascii="Calibri" w:hAnsi="Calibri" w:eastAsia="Calibri" w:cs=""/>
-                <w:kern w:val="0"/>
-                <w:sz w:val="22"/>
-                <w:szCs w:val="22"/>
-                <w:lang w:val="ru-RU" w:eastAsia="en-US" w:bidi="ar-SA"/>
-              </w:rPr>
-            </w:pPr>
-            <w:r>
-              <w:rPr>
-                <w:rFonts w:eastAsia="Calibri" w:cs=""/>
-                <w:kern w:val="0"/>
-                <w:sz w:val="22"/>
-                <w:szCs w:val="22"/>
-                <w:lang w:val="ru-RU" w:eastAsia="en-US" w:bidi="ar-SA"/>
-              </w:rPr>
-              <w:t xml:space="preserve"> </w:t>
+              <w:suppressAutoHyphens w:val="true"/>
+              <w:spacing w:lineRule="auto" w:line="240" w:before="0" w:after="0"/>
+              <w:jc w:val="left"/>
+              <w:rPr>
+                <w:rFonts w:ascii="Calibri" w:hAnsi="Calibri" w:eastAsia="Calibri" w:cs=""/>
+                <w:kern w:val="0"/>
+                <w:sz w:val="22"/>
+                <w:szCs w:val="22"/>
+                <w:lang w:val="ru-RU" w:eastAsia="en-US" w:bidi="ar-SA"/>
+              </w:rPr>
+            </w:pPr>
+            <w:r>
+              <w:rPr/>
             </w:r>
           </w:p>
         </w:tc>
@@ -2173,6 +2214,7 @@
             <w:pPr>
               <w:pStyle w:val="Normal"/>
               <w:widowControl/>
+              <w:suppressAutoHyphens w:val="true"/>
               <w:spacing w:lineRule="auto" w:line="240" w:before="0" w:after="0"/>
               <w:jc w:val="left"/>
               <w:rPr>
@@ -2204,6 +2246,7 @@
             <w:pPr>
               <w:pStyle w:val="Normal"/>
               <w:widowControl/>
+              <w:suppressAutoHyphens w:val="true"/>
               <w:spacing w:lineRule="auto" w:line="240" w:before="0" w:after="0"/>
               <w:jc w:val="left"/>
               <w:rPr>
@@ -2235,6 +2278,7 @@
             <w:pPr>
               <w:pStyle w:val="Normal"/>
               <w:widowControl/>
+              <w:suppressAutoHyphens w:val="true"/>
               <w:spacing w:lineRule="auto" w:line="240" w:before="0" w:after="0"/>
               <w:jc w:val="left"/>
               <w:rPr>
@@ -2260,6 +2304,7 @@
             <w:pPr>
               <w:pStyle w:val="Normal"/>
               <w:widowControl/>
+              <w:suppressAutoHyphens w:val="true"/>
               <w:spacing w:lineRule="auto" w:line="240" w:before="0" w:after="0"/>
               <w:jc w:val="left"/>
               <w:rPr>
@@ -2315,6 +2360,7 @@
             <w:pPr>
               <w:pStyle w:val="Normal"/>
               <w:widowControl/>
+              <w:suppressAutoHyphens w:val="true"/>
               <w:spacing w:lineRule="auto" w:line="240" w:before="0" w:after="0"/>
               <w:jc w:val="left"/>
               <w:rPr>
@@ -2346,6 +2392,7 @@
             <w:pPr>
               <w:pStyle w:val="Normal"/>
               <w:widowControl/>
+              <w:suppressAutoHyphens w:val="true"/>
               <w:spacing w:lineRule="auto" w:line="240" w:before="0" w:after="0"/>
               <w:jc w:val="left"/>
               <w:rPr>
@@ -2377,6 +2424,7 @@
             <w:pPr>
               <w:pStyle w:val="Normal"/>
               <w:widowControl/>
+              <w:suppressAutoHyphens w:val="true"/>
               <w:spacing w:lineRule="auto" w:line="240" w:before="0" w:after="0"/>
               <w:jc w:val="left"/>
               <w:rPr>
@@ -2402,6 +2450,7 @@
             <w:pPr>
               <w:pStyle w:val="Normal"/>
               <w:widowControl/>
+              <w:suppressAutoHyphens w:val="true"/>
               <w:spacing w:lineRule="auto" w:line="240" w:before="0" w:after="0"/>
               <w:jc w:val="left"/>
               <w:rPr>
@@ -2457,6 +2506,7 @@
             <w:pPr>
               <w:pStyle w:val="Normal"/>
               <w:widowControl/>
+              <w:suppressAutoHyphens w:val="true"/>
               <w:spacing w:lineRule="auto" w:line="240" w:before="0" w:after="0"/>
               <w:jc w:val="left"/>
               <w:rPr>
@@ -2488,6 +2538,7 @@
             <w:pPr>
               <w:pStyle w:val="Normal"/>
               <w:widowControl/>
+              <w:suppressAutoHyphens w:val="true"/>
               <w:spacing w:lineRule="auto" w:line="240" w:before="0" w:after="0"/>
               <w:jc w:val="left"/>
               <w:rPr>
@@ -2519,6 +2570,7 @@
             <w:pPr>
               <w:pStyle w:val="Normal"/>
               <w:widowControl/>
+              <w:suppressAutoHyphens w:val="true"/>
               <w:spacing w:lineRule="auto" w:line="240" w:before="0" w:after="0"/>
               <w:jc w:val="left"/>
               <w:rPr>
@@ -2544,6 +2596,7 @@
             <w:pPr>
               <w:pStyle w:val="Normal"/>
               <w:widowControl/>
+              <w:suppressAutoHyphens w:val="true"/>
               <w:spacing w:lineRule="auto" w:line="240" w:before="0" w:after="0"/>
               <w:jc w:val="left"/>
               <w:rPr>
@@ -2599,6 +2652,7 @@
             <w:pPr>
               <w:pStyle w:val="Normal"/>
               <w:widowControl/>
+              <w:suppressAutoHyphens w:val="true"/>
               <w:spacing w:lineRule="auto" w:line="240" w:before="0" w:after="0"/>
               <w:jc w:val="left"/>
               <w:rPr>
@@ -2630,6 +2684,7 @@
             <w:pPr>
               <w:pStyle w:val="Normal"/>
               <w:widowControl/>
+              <w:suppressAutoHyphens w:val="true"/>
               <w:spacing w:lineRule="auto" w:line="240" w:before="0" w:after="0"/>
               <w:jc w:val="left"/>
               <w:rPr>
@@ -2661,6 +2716,7 @@
             <w:pPr>
               <w:pStyle w:val="Normal"/>
               <w:widowControl/>
+              <w:suppressAutoHyphens w:val="true"/>
               <w:spacing w:lineRule="auto" w:line="240" w:before="0" w:after="0"/>
               <w:jc w:val="left"/>
               <w:rPr>
@@ -2686,6 +2742,7 @@
             <w:pPr>
               <w:pStyle w:val="Normal"/>
               <w:widowControl/>
+              <w:suppressAutoHyphens w:val="true"/>
               <w:spacing w:lineRule="auto" w:line="240" w:before="0" w:after="0"/>
               <w:jc w:val="left"/>
               <w:rPr>
@@ -2741,6 +2798,7 @@
             <w:pPr>
               <w:pStyle w:val="Normal"/>
               <w:widowControl/>
+              <w:suppressAutoHyphens w:val="true"/>
               <w:spacing w:lineRule="auto" w:line="240" w:before="0" w:after="0"/>
               <w:jc w:val="left"/>
               <w:rPr>
@@ -2772,6 +2830,7 @@
             <w:pPr>
               <w:pStyle w:val="Normal"/>
               <w:widowControl/>
+              <w:suppressAutoHyphens w:val="true"/>
               <w:spacing w:lineRule="auto" w:line="240" w:before="0" w:after="0"/>
               <w:jc w:val="left"/>
               <w:rPr>
@@ -2803,6 +2862,7 @@
             <w:pPr>
               <w:pStyle w:val="Normal"/>
               <w:widowControl/>
+              <w:suppressAutoHyphens w:val="true"/>
               <w:spacing w:lineRule="auto" w:line="240" w:before="0" w:after="0"/>
               <w:jc w:val="left"/>
               <w:rPr>
@@ -2828,6 +2888,7 @@
             <w:pPr>
               <w:pStyle w:val="Normal"/>
               <w:widowControl/>
+              <w:suppressAutoHyphens w:val="true"/>
               <w:spacing w:lineRule="auto" w:line="240" w:before="0" w:after="0"/>
               <w:jc w:val="left"/>
               <w:rPr>
@@ -2883,6 +2944,7 @@
             <w:pPr>
               <w:pStyle w:val="Normal"/>
               <w:widowControl/>
+              <w:suppressAutoHyphens w:val="true"/>
               <w:spacing w:lineRule="auto" w:line="240" w:before="0" w:after="0"/>
               <w:jc w:val="left"/>
               <w:rPr>
@@ -2914,6 +2976,7 @@
             <w:pPr>
               <w:pStyle w:val="Normal"/>
               <w:widowControl/>
+              <w:suppressAutoHyphens w:val="true"/>
               <w:spacing w:lineRule="auto" w:line="240" w:before="0" w:after="0"/>
               <w:jc w:val="left"/>
               <w:rPr>
@@ -2945,6 +3008,7 @@
             <w:pPr>
               <w:pStyle w:val="Normal"/>
               <w:widowControl/>
+              <w:suppressAutoHyphens w:val="true"/>
               <w:spacing w:lineRule="auto" w:line="240" w:before="0" w:after="0"/>
               <w:jc w:val="left"/>
               <w:rPr>
@@ -2970,6 +3034,7 @@
             <w:pPr>
               <w:pStyle w:val="Normal"/>
               <w:widowControl/>
+              <w:suppressAutoHyphens w:val="true"/>
               <w:spacing w:lineRule="auto" w:line="240" w:before="0" w:after="0"/>
               <w:jc w:val="left"/>
               <w:rPr>
@@ -3025,6 +3090,7 @@
             <w:pPr>
               <w:pStyle w:val="Normal"/>
               <w:widowControl/>
+              <w:suppressAutoHyphens w:val="true"/>
               <w:spacing w:lineRule="auto" w:line="240" w:before="0" w:after="0"/>
               <w:jc w:val="left"/>
               <w:rPr>
@@ -3056,6 +3122,7 @@
             <w:pPr>
               <w:pStyle w:val="Normal"/>
               <w:widowControl/>
+              <w:suppressAutoHyphens w:val="true"/>
               <w:spacing w:lineRule="auto" w:line="240" w:before="0" w:after="0"/>
               <w:jc w:val="left"/>
               <w:rPr>
@@ -3087,6 +3154,7 @@
             <w:pPr>
               <w:pStyle w:val="Normal"/>
               <w:widowControl/>
+              <w:suppressAutoHyphens w:val="true"/>
               <w:spacing w:lineRule="auto" w:line="240" w:before="0" w:after="0"/>
               <w:jc w:val="left"/>
               <w:rPr>
@@ -3142,6 +3210,7 @@
             <w:pPr>
               <w:pStyle w:val="Normal"/>
               <w:widowControl/>
+              <w:suppressAutoHyphens w:val="true"/>
               <w:spacing w:lineRule="auto" w:line="240" w:before="0" w:after="0"/>
               <w:jc w:val="left"/>
               <w:rPr>
@@ -3173,6 +3242,7 @@
             <w:pPr>
               <w:pStyle w:val="Normal"/>
               <w:widowControl/>
+              <w:suppressAutoHyphens w:val="true"/>
               <w:spacing w:lineRule="auto" w:line="240" w:before="0" w:after="0"/>
               <w:jc w:val="left"/>
               <w:rPr>
@@ -3204,6 +3274,7 @@
             <w:pPr>
               <w:pStyle w:val="Normal"/>
               <w:widowControl/>
+              <w:suppressAutoHyphens w:val="true"/>
               <w:spacing w:lineRule="auto" w:line="240" w:before="0" w:after="0"/>
               <w:jc w:val="left"/>
               <w:rPr>
@@ -3250,6 +3321,7 @@
             <w:pPr>
               <w:pStyle w:val="Normal"/>
               <w:widowControl/>
+              <w:suppressAutoHyphens w:val="true"/>
               <w:spacing w:lineRule="auto" w:line="240" w:before="0" w:after="0"/>
               <w:jc w:val="left"/>
               <w:rPr>
@@ -3278,7 +3350,27 @@
                 <w:szCs w:val="22"/>
                 <w:lang w:val="ru-RU" w:eastAsia="en-US" w:bidi="ar-SA"/>
               </w:rPr>
-              <w:t>2)Из «Нагрузки по кандидатским экзаменам» подтягиваются часы из столбца Количество часов .</w:t>
+              <w:t xml:space="preserve">2)Из «Нагрузки по кандидатским экзаменам» подтягиваются часы из столбца Количество часов </w:t>
+            </w:r>
+            <w:r>
+              <w:rPr>
+                <w:rFonts w:eastAsia="Calibri" w:cs=""/>
+                <w:kern w:val="0"/>
+                <w:sz w:val="22"/>
+                <w:szCs w:val="22"/>
+                <w:lang w:val="ru-RU" w:eastAsia="en-US" w:bidi="ar-SA"/>
+              </w:rPr>
+              <w:t>(15)</w:t>
+            </w:r>
+            <w:r>
+              <w:rPr>
+                <w:rFonts w:eastAsia="Calibri" w:cs=""/>
+                <w:kern w:val="0"/>
+                <w:sz w:val="22"/>
+                <w:szCs w:val="22"/>
+                <w:lang w:val="ru-RU" w:eastAsia="en-US" w:bidi="ar-SA"/>
+              </w:rPr>
+              <w:t>.</w:t>
             </w:r>
           </w:p>
         </w:tc>
@@ -3294,6 +3386,7 @@
             <w:pPr>
               <w:pStyle w:val="Normal"/>
               <w:widowControl/>
+              <w:suppressAutoHyphens w:val="true"/>
               <w:spacing w:lineRule="auto" w:line="240" w:before="0" w:after="0"/>
               <w:jc w:val="left"/>
               <w:rPr>
@@ -3325,6 +3418,7 @@
             <w:pPr>
               <w:pStyle w:val="Normal"/>
               <w:widowControl/>
+              <w:suppressAutoHyphens w:val="true"/>
               <w:spacing w:lineRule="auto" w:line="240" w:before="0" w:after="0"/>
               <w:jc w:val="left"/>
               <w:rPr>
@@ -3356,6 +3450,7 @@
             <w:pPr>
               <w:pStyle w:val="Normal"/>
               <w:widowControl/>
+              <w:suppressAutoHyphens w:val="true"/>
               <w:spacing w:lineRule="auto" w:line="240" w:before="0" w:after="0"/>
               <w:jc w:val="left"/>
               <w:rPr>
@@ -3390,6 +3485,7 @@
             <w:pPr>
               <w:pStyle w:val="Normal"/>
               <w:widowControl/>
+              <w:suppressAutoHyphens w:val="true"/>
               <w:spacing w:lineRule="auto" w:line="240" w:before="0" w:after="0"/>
               <w:jc w:val="left"/>
               <w:rPr>
@@ -3421,6 +3517,7 @@
             <w:pPr>
               <w:pStyle w:val="Normal"/>
               <w:widowControl/>
+              <w:suppressAutoHyphens w:val="true"/>
               <w:spacing w:lineRule="auto" w:line="240" w:before="0" w:after="0"/>
               <w:jc w:val="left"/>
               <w:rPr>
@@ -3452,6 +3549,7 @@
             <w:pPr>
               <w:pStyle w:val="Normal"/>
               <w:widowControl/>
+              <w:suppressAutoHyphens w:val="true"/>
               <w:spacing w:lineRule="auto" w:line="240" w:before="0" w:after="0"/>
               <w:jc w:val="left"/>
               <w:rPr>
@@ -3477,6 +3575,7 @@
             <w:pPr>
               <w:pStyle w:val="Normal"/>
               <w:widowControl/>
+              <w:suppressAutoHyphens w:val="true"/>
               <w:spacing w:lineRule="auto" w:line="240" w:before="0" w:after="0"/>
               <w:jc w:val="left"/>
               <w:rPr>
@@ -3542,6 +3641,7 @@
             <w:pPr>
               <w:pStyle w:val="Normal"/>
               <w:widowControl/>
+              <w:suppressAutoHyphens w:val="true"/>
               <w:spacing w:lineRule="auto" w:line="240" w:before="0" w:after="0"/>
               <w:jc w:val="left"/>
               <w:rPr>
@@ -3573,6 +3673,7 @@
             <w:pPr>
               <w:pStyle w:val="Normal"/>
               <w:widowControl/>
+              <w:suppressAutoHyphens w:val="true"/>
               <w:spacing w:lineRule="auto" w:line="240" w:before="0" w:after="0"/>
               <w:jc w:val="left"/>
               <w:rPr>
@@ -3604,6 +3705,7 @@
             <w:pPr>
               <w:pStyle w:val="Normal"/>
               <w:widowControl/>
+              <w:suppressAutoHyphens w:val="true"/>
               <w:spacing w:lineRule="auto" w:line="240" w:before="0" w:after="0"/>
               <w:jc w:val="left"/>
               <w:rPr>
@@ -3629,6 +3731,7 @@
             <w:pPr>
               <w:pStyle w:val="Normal"/>
               <w:widowControl/>
+              <w:suppressAutoHyphens w:val="true"/>
               <w:spacing w:lineRule="auto" w:line="240" w:before="0" w:after="0"/>
               <w:jc w:val="left"/>
               <w:rPr>
@@ -3694,6 +3797,7 @@
             <w:pPr>
               <w:pStyle w:val="Normal"/>
               <w:widowControl/>
+              <w:suppressAutoHyphens w:val="true"/>
               <w:spacing w:lineRule="auto" w:line="240" w:before="0" w:after="0"/>
               <w:jc w:val="left"/>
               <w:rPr>
@@ -3725,6 +3829,7 @@
             <w:pPr>
               <w:pStyle w:val="Normal"/>
               <w:widowControl/>
+              <w:suppressAutoHyphens w:val="true"/>
               <w:spacing w:lineRule="auto" w:line="240" w:before="0" w:after="0"/>
               <w:jc w:val="left"/>
               <w:rPr>
@@ -3756,6 +3861,7 @@
             <w:pPr>
               <w:pStyle w:val="Normal"/>
               <w:widowControl/>
+              <w:suppressAutoHyphens w:val="true"/>
               <w:spacing w:lineRule="auto" w:line="240" w:before="0" w:after="0"/>
               <w:jc w:val="left"/>
               <w:rPr>
@@ -3781,6 +3887,7 @@
             <w:pPr>
               <w:pStyle w:val="Normal"/>
               <w:widowControl/>
+              <w:suppressAutoHyphens w:val="true"/>
               <w:spacing w:lineRule="auto" w:line="240" w:before="0" w:after="0"/>
               <w:jc w:val="left"/>
               <w:rPr>
@@ -3846,6 +3953,7 @@
             <w:pPr>
               <w:pStyle w:val="Normal"/>
               <w:widowControl/>
+              <w:suppressAutoHyphens w:val="true"/>
               <w:spacing w:lineRule="auto" w:line="240" w:before="0" w:after="0"/>
               <w:jc w:val="left"/>
               <w:rPr>
@@ -3877,6 +3985,7 @@
             <w:pPr>
               <w:pStyle w:val="Normal"/>
               <w:widowControl/>
+              <w:suppressAutoHyphens w:val="true"/>
               <w:spacing w:lineRule="auto" w:line="240" w:before="0" w:after="0"/>
               <w:jc w:val="left"/>
               <w:rPr>
@@ -3908,6 +4017,7 @@
             <w:pPr>
               <w:pStyle w:val="Normal"/>
               <w:widowControl/>
+              <w:suppressAutoHyphens w:val="true"/>
               <w:spacing w:lineRule="auto" w:line="240" w:before="0" w:after="0"/>
               <w:jc w:val="left"/>
               <w:rPr>
@@ -3933,6 +4043,7 @@
             <w:pPr>
               <w:pStyle w:val="Normal"/>
               <w:widowControl/>
+              <w:suppressAutoHyphens w:val="true"/>
               <w:spacing w:lineRule="auto" w:line="240" w:before="0" w:after="0"/>
               <w:jc w:val="left"/>
               <w:rPr>
@@ -3998,6 +4109,7 @@
             <w:pPr>
               <w:pStyle w:val="Normal"/>
               <w:widowControl/>
+              <w:suppressAutoHyphens w:val="true"/>
               <w:spacing w:lineRule="auto" w:line="240" w:before="0" w:after="0"/>
               <w:jc w:val="left"/>
               <w:rPr>
@@ -4029,6 +4141,7 @@
             <w:pPr>
               <w:pStyle w:val="Normal"/>
               <w:widowControl/>
+              <w:suppressAutoHyphens w:val="true"/>
               <w:spacing w:lineRule="auto" w:line="240" w:before="0" w:after="0"/>
               <w:jc w:val="left"/>
               <w:rPr>
@@ -4060,6 +4173,7 @@
             <w:pPr>
               <w:pStyle w:val="Normal"/>
               <w:widowControl/>
+              <w:suppressAutoHyphens w:val="true"/>
               <w:spacing w:lineRule="auto" w:line="240" w:before="0" w:after="0"/>
               <w:jc w:val="left"/>
               <w:rPr>
@@ -4085,6 +4199,7 @@
             <w:pPr>
               <w:pStyle w:val="Normal"/>
               <w:widowControl/>
+              <w:suppressAutoHyphens w:val="true"/>
               <w:spacing w:lineRule="auto" w:line="240" w:before="0" w:after="0"/>
               <w:jc w:val="left"/>
               <w:rPr>
@@ -4150,6 +4265,7 @@
             <w:pPr>
               <w:pStyle w:val="Normal"/>
               <w:widowControl/>
+              <w:suppressAutoHyphens w:val="true"/>
               <w:spacing w:lineRule="auto" w:line="240" w:before="0" w:after="0"/>
               <w:jc w:val="left"/>
               <w:rPr>
@@ -4181,6 +4297,7 @@
             <w:pPr>
               <w:pStyle w:val="Normal"/>
               <w:widowControl/>
+              <w:suppressAutoHyphens w:val="true"/>
               <w:spacing w:lineRule="auto" w:line="240" w:before="0" w:after="0"/>
               <w:jc w:val="left"/>
               <w:rPr>
@@ -4212,6 +4329,7 @@
             <w:pPr>
               <w:pStyle w:val="Normal"/>
               <w:widowControl/>
+              <w:suppressAutoHyphens w:val="true"/>
               <w:spacing w:lineRule="auto" w:line="240" w:before="0" w:after="0"/>
               <w:jc w:val="left"/>
               <w:rPr>
@@ -4237,6 +4355,7 @@
             <w:pPr>
               <w:pStyle w:val="Normal"/>
               <w:widowControl/>
+              <w:suppressAutoHyphens w:val="true"/>
               <w:spacing w:lineRule="auto" w:line="240" w:before="0" w:after="0"/>
               <w:jc w:val="left"/>
               <w:rPr>
@@ -4302,6 +4421,7 @@
             <w:pPr>
               <w:pStyle w:val="Normal"/>
               <w:widowControl/>
+              <w:suppressAutoHyphens w:val="true"/>
               <w:spacing w:lineRule="auto" w:line="240" w:before="0" w:after="0"/>
               <w:jc w:val="left"/>
               <w:rPr>
@@ -4333,6 +4453,7 @@
             <w:pPr>
               <w:pStyle w:val="Normal"/>
               <w:widowControl/>
+              <w:suppressAutoHyphens w:val="true"/>
               <w:spacing w:lineRule="auto" w:line="240" w:before="0" w:after="0"/>
               <w:jc w:val="left"/>
               <w:rPr>
@@ -4364,6 +4485,7 @@
             <w:pPr>
               <w:pStyle w:val="Normal"/>
               <w:widowControl/>
+              <w:suppressAutoHyphens w:val="true"/>
               <w:spacing w:lineRule="auto" w:line="240" w:before="0" w:after="0"/>
               <w:jc w:val="left"/>
               <w:rPr>
@@ -4389,6 +4511,7 @@
             <w:pPr>
               <w:pStyle w:val="Normal"/>
               <w:widowControl/>
+              <w:suppressAutoHyphens w:val="true"/>
               <w:spacing w:lineRule="auto" w:line="240" w:before="0" w:after="0"/>
               <w:jc w:val="left"/>
               <w:rPr>
@@ -4454,6 +4577,7 @@
             <w:pPr>
               <w:pStyle w:val="Normal"/>
               <w:widowControl/>
+              <w:suppressAutoHyphens w:val="true"/>
               <w:spacing w:lineRule="auto" w:line="240" w:before="0" w:after="0"/>
               <w:jc w:val="left"/>
               <w:rPr>
@@ -4485,6 +4609,7 @@
             <w:pPr>
               <w:pStyle w:val="Normal"/>
               <w:widowControl/>
+              <w:suppressAutoHyphens w:val="true"/>
               <w:spacing w:lineRule="auto" w:line="240" w:before="0" w:after="0"/>
               <w:jc w:val="left"/>
               <w:rPr>
@@ -4516,6 +4641,7 @@
             <w:pPr>
               <w:pStyle w:val="Normal"/>
               <w:widowControl/>
+              <w:suppressAutoHyphens w:val="true"/>
               <w:spacing w:lineRule="auto" w:line="240" w:before="0" w:after="0"/>
               <w:jc w:val="left"/>
               <w:rPr>
@@ -4541,6 +4667,7 @@
             <w:pPr>
               <w:pStyle w:val="Normal"/>
               <w:widowControl/>
+              <w:suppressAutoHyphens w:val="true"/>
               <w:spacing w:lineRule="auto" w:line="240" w:before="0" w:after="0"/>
               <w:jc w:val="left"/>
               <w:rPr>
@@ -4606,6 +4733,7 @@
             <w:pPr>
               <w:pStyle w:val="Normal"/>
               <w:widowControl/>
+              <w:suppressAutoHyphens w:val="true"/>
               <w:spacing w:lineRule="auto" w:line="240" w:before="0" w:after="0"/>
               <w:jc w:val="left"/>
               <w:rPr>
@@ -4637,6 +4765,7 @@
             <w:pPr>
               <w:pStyle w:val="Normal"/>
               <w:widowControl/>
+              <w:suppressAutoHyphens w:val="true"/>
               <w:spacing w:lineRule="auto" w:line="240" w:before="0" w:after="0"/>
               <w:jc w:val="left"/>
               <w:rPr>
@@ -4668,6 +4797,7 @@
             <w:pPr>
               <w:pStyle w:val="Normal"/>
               <w:widowControl/>
+              <w:suppressAutoHyphens w:val="true"/>
               <w:spacing w:lineRule="auto" w:line="240" w:before="0" w:after="0"/>
               <w:jc w:val="left"/>
               <w:rPr>
@@ -4693,6 +4823,7 @@
             <w:pPr>
               <w:pStyle w:val="Normal"/>
               <w:widowControl/>
+              <w:suppressAutoHyphens w:val="true"/>
               <w:spacing w:lineRule="auto" w:line="240" w:before="0" w:after="0"/>
               <w:jc w:val="left"/>
               <w:rPr>
@@ -4758,6 +4889,7 @@
             <w:pPr>
               <w:pStyle w:val="Normal"/>
               <w:widowControl/>
+              <w:suppressAutoHyphens w:val="true"/>
               <w:spacing w:lineRule="auto" w:line="240" w:before="0" w:after="0"/>
               <w:jc w:val="left"/>
               <w:rPr>
@@ -4789,6 +4921,7 @@
             <w:pPr>
               <w:pStyle w:val="Normal"/>
               <w:widowControl/>
+              <w:suppressAutoHyphens w:val="true"/>
               <w:spacing w:lineRule="auto" w:line="240" w:before="0" w:after="0"/>
               <w:jc w:val="left"/>
               <w:rPr>
@@ -4820,6 +4953,7 @@
             <w:pPr>
               <w:pStyle w:val="Normal"/>
               <w:widowControl/>
+              <w:suppressAutoHyphens w:val="true"/>
               <w:spacing w:lineRule="auto" w:line="240" w:before="0" w:after="0"/>
               <w:jc w:val="left"/>
               <w:rPr>
@@ -4854,6 +4988,7 @@
             <w:pPr>
               <w:pStyle w:val="Normal"/>
               <w:widowControl/>
+              <w:suppressAutoHyphens w:val="true"/>
               <w:spacing w:lineRule="auto" w:line="240" w:before="0" w:after="0"/>
               <w:jc w:val="left"/>
               <w:rPr>
@@ -4885,6 +5020,7 @@
             <w:pPr>
               <w:pStyle w:val="Normal"/>
               <w:widowControl/>
+              <w:suppressAutoHyphens w:val="true"/>
               <w:spacing w:lineRule="auto" w:line="240" w:before="0" w:after="0"/>
               <w:jc w:val="left"/>
               <w:rPr>
@@ -4916,6 +5052,7 @@
             <w:pPr>
               <w:pStyle w:val="Normal"/>
               <w:widowControl/>
+              <w:suppressAutoHyphens w:val="true"/>
               <w:spacing w:lineRule="auto" w:line="240" w:before="0" w:after="0"/>
               <w:jc w:val="left"/>
               <w:rPr>
@@ -4950,6 +5087,7 @@
             <w:pPr>
               <w:pStyle w:val="Normal"/>
               <w:widowControl/>
+              <w:suppressAutoHyphens w:val="true"/>
               <w:spacing w:lineRule="auto" w:line="240" w:before="0" w:after="0"/>
               <w:jc w:val="left"/>
               <w:rPr>
@@ -4981,6 +5119,7 @@
             <w:pPr>
               <w:pStyle w:val="Normal"/>
               <w:widowControl/>
+              <w:suppressAutoHyphens w:val="true"/>
               <w:spacing w:lineRule="auto" w:line="240" w:before="0" w:after="0"/>
               <w:jc w:val="left"/>
               <w:rPr>
@@ -5012,6 +5151,7 @@
             <w:pPr>
               <w:pStyle w:val="Normal"/>
               <w:widowControl/>
+              <w:suppressAutoHyphens w:val="true"/>
               <w:spacing w:lineRule="auto" w:line="240" w:before="0" w:after="0"/>
               <w:jc w:val="left"/>
               <w:rPr>
@@ -5046,6 +5186,7 @@
             <w:pPr>
               <w:pStyle w:val="Normal"/>
               <w:widowControl/>
+              <w:suppressAutoHyphens w:val="true"/>
               <w:spacing w:lineRule="auto" w:line="240" w:before="0" w:after="0"/>
               <w:jc w:val="left"/>
               <w:rPr>
@@ -5077,6 +5218,7 @@
             <w:pPr>
               <w:pStyle w:val="Normal"/>
               <w:widowControl/>
+              <w:suppressAutoHyphens w:val="true"/>
               <w:spacing w:lineRule="auto" w:line="240" w:before="0" w:after="0"/>
               <w:jc w:val="left"/>
               <w:rPr>
@@ -5108,6 +5250,7 @@
             <w:pPr>
               <w:pStyle w:val="Normal"/>
               <w:widowControl/>
+              <w:suppressAutoHyphens w:val="true"/>
               <w:spacing w:lineRule="auto" w:line="240" w:before="0" w:after="0"/>
               <w:jc w:val="left"/>
               <w:rPr>
@@ -5142,6 +5285,7 @@
             <w:pPr>
               <w:pStyle w:val="Normal"/>
               <w:widowControl/>
+              <w:suppressAutoHyphens w:val="true"/>
               <w:spacing w:lineRule="auto" w:line="240" w:before="0" w:after="0"/>
               <w:jc w:val="left"/>
               <w:rPr>
@@ -5173,6 +5317,7 @@
             <w:pPr>
               <w:pStyle w:val="Normal"/>
               <w:widowControl/>
+              <w:suppressAutoHyphens w:val="true"/>
               <w:spacing w:lineRule="auto" w:line="240" w:before="0" w:after="0"/>
               <w:jc w:val="left"/>
               <w:rPr>
@@ -5204,31 +5349,33 @@
             <w:pPr>
               <w:pStyle w:val="Normal"/>
               <w:widowControl/>
-              <w:spacing w:lineRule="auto" w:line="240" w:before="0" w:after="0"/>
-              <w:jc w:val="left"/>
-              <w:rPr>
-                <w:rFonts w:ascii="Calibri" w:hAnsi="Calibri" w:eastAsia="Calibri" w:cs=""/>
-                <w:kern w:val="0"/>
-                <w:sz w:val="22"/>
-                <w:szCs w:val="22"/>
-                <w:lang w:val="ru-RU" w:eastAsia="en-US" w:bidi="ar-SA"/>
-              </w:rPr>
-            </w:pPr>
-            <w:r>
-              <w:rPr>
-                <w:rFonts w:eastAsia="Calibri" w:cs=""/>
-                <w:kern w:val="0"/>
-                <w:sz w:val="22"/>
-                <w:szCs w:val="22"/>
-                <w:lang w:val="ru-RU" w:eastAsia="en-US" w:bidi="ar-SA"/>
-              </w:rPr>
-              <w:t xml:space="preserve">Столбец Комментарий (17). </w:t>
-            </w:r>
-          </w:p>
-          <w:p>
-            <w:pPr>
-              <w:pStyle w:val="Normal"/>
-              <w:widowControl/>
+              <w:suppressAutoHyphens w:val="true"/>
+              <w:spacing w:lineRule="auto" w:line="240" w:before="0" w:after="0"/>
+              <w:jc w:val="left"/>
+              <w:rPr>
+                <w:rFonts w:ascii="Calibri" w:hAnsi="Calibri" w:eastAsia="Calibri" w:cs=""/>
+                <w:kern w:val="0"/>
+                <w:sz w:val="22"/>
+                <w:szCs w:val="22"/>
+                <w:lang w:val="ru-RU" w:eastAsia="en-US" w:bidi="ar-SA"/>
+              </w:rPr>
+            </w:pPr>
+            <w:r>
+              <w:rPr>
+                <w:rFonts w:eastAsia="Calibri" w:cs=""/>
+                <w:kern w:val="0"/>
+                <w:sz w:val="22"/>
+                <w:szCs w:val="22"/>
+                <w:lang w:val="ru-RU" w:eastAsia="en-US" w:bidi="ar-SA"/>
+              </w:rPr>
+              <w:t>Столбец Комментарий (17).</w:t>
+            </w:r>
+          </w:p>
+          <w:p>
+            <w:pPr>
+              <w:pStyle w:val="Normal"/>
+              <w:widowControl/>
+              <w:suppressAutoHyphens w:val="true"/>
               <w:spacing w:lineRule="auto" w:line="240" w:before="0" w:after="0"/>
               <w:jc w:val="left"/>
               <w:rPr>
@@ -5262,6 +5409,7 @@
             <w:pPr>
               <w:pStyle w:val="Normal"/>
               <w:widowControl/>
+              <w:suppressAutoHyphens w:val="true"/>
               <w:spacing w:lineRule="auto" w:line="240" w:before="0" w:after="0"/>
               <w:jc w:val="left"/>
               <w:rPr>
@@ -5293,25 +5441,26 @@
             <w:pPr>
               <w:pStyle w:val="Normal"/>
               <w:widowControl/>
-              <w:spacing w:lineRule="auto" w:line="240" w:before="0" w:after="0"/>
-              <w:jc w:val="left"/>
-              <w:rPr>
-                <w:rFonts w:ascii="Calibri" w:hAnsi="Calibri" w:eastAsia="Calibri" w:cs=""/>
-                <w:kern w:val="0"/>
-                <w:sz w:val="22"/>
-                <w:szCs w:val="22"/>
-                <w:lang w:val="ru-RU" w:eastAsia="en-US" w:bidi="ar-SA"/>
-              </w:rPr>
-            </w:pPr>
-            <w:r>
-              <w:rPr>
-                <w:rFonts w:eastAsia="Calibri" w:cs=""/>
-                <w:kern w:val="0"/>
-                <w:sz w:val="22"/>
-                <w:szCs w:val="22"/>
-                <w:lang w:val="ru-RU" w:eastAsia="en-US" w:bidi="ar-SA"/>
-              </w:rPr>
-              <w:t xml:space="preserve">Общая нагрузка – Сумма часов  столбцов (с 18 по 40) отчета </w:t>
+              <w:suppressAutoHyphens w:val="true"/>
+              <w:spacing w:lineRule="auto" w:line="240" w:before="0" w:after="0"/>
+              <w:jc w:val="left"/>
+              <w:rPr>
+                <w:rFonts w:ascii="Calibri" w:hAnsi="Calibri" w:eastAsia="Calibri" w:cs=""/>
+                <w:kern w:val="0"/>
+                <w:sz w:val="22"/>
+                <w:szCs w:val="22"/>
+                <w:lang w:val="ru-RU" w:eastAsia="en-US" w:bidi="ar-SA"/>
+              </w:rPr>
+            </w:pPr>
+            <w:r>
+              <w:rPr>
+                <w:rFonts w:eastAsia="Calibri" w:cs=""/>
+                <w:kern w:val="0"/>
+                <w:sz w:val="22"/>
+                <w:szCs w:val="22"/>
+                <w:lang w:val="ru-RU" w:eastAsia="en-US" w:bidi="ar-SA"/>
+              </w:rPr>
+              <w:t>Общая нагрузка – Сумма часов  столбцов (с 18 по 40) отчета</w:t>
             </w:r>
           </w:p>
         </w:tc>
@@ -5324,45 +5473,26 @@
             <w:pPr>
               <w:pStyle w:val="Normal"/>
               <w:widowControl/>
-              <w:spacing w:lineRule="auto" w:line="240" w:before="0" w:after="0"/>
-              <w:jc w:val="left"/>
-              <w:rPr>
-                <w:rFonts w:ascii="Calibri" w:hAnsi="Calibri" w:eastAsia="Calibri" w:cs=""/>
-                <w:kern w:val="0"/>
-                <w:sz w:val="22"/>
-                <w:szCs w:val="22"/>
-                <w:lang w:val="ru-RU" w:eastAsia="en-US" w:bidi="ar-SA"/>
-              </w:rPr>
-            </w:pPr>
-            <w:r>
-              <w:rPr>
-                <w:rFonts w:eastAsia="Calibri" w:cs=""/>
-                <w:kern w:val="0"/>
-                <w:sz w:val="22"/>
-                <w:szCs w:val="22"/>
-                <w:lang w:val="ru-RU" w:eastAsia="en-US" w:bidi="ar-SA"/>
-              </w:rPr>
-              <w:t>ПУСТО (</w:t>
-            </w:r>
-            <w:r>
-              <w:rPr>
-                <w:rFonts w:eastAsia="Calibri" w:cs=""/>
-                <w:kern w:val="0"/>
-                <w:sz w:val="22"/>
-                <w:szCs w:val="22"/>
-                <w:lang w:val="ru-RU" w:eastAsia="en-US" w:bidi="ar-SA"/>
-              </w:rPr>
-              <w:t>Информация не из ЛК ЗК</w:t>
-            </w:r>
-            <w:r>
-              <w:rPr>
-                <w:rFonts w:eastAsia="Calibri" w:cs=""/>
-                <w:kern w:val="0"/>
-                <w:sz w:val="22"/>
-                <w:szCs w:val="22"/>
-                <w:lang w:val="ru-RU" w:eastAsia="en-US" w:bidi="ar-SA"/>
-              </w:rPr>
-              <w:t>)</w:t>
+              <w:suppressAutoHyphens w:val="true"/>
+              <w:spacing w:lineRule="auto" w:line="240" w:before="0" w:after="0"/>
+              <w:jc w:val="left"/>
+              <w:rPr>
+                <w:rFonts w:ascii="Calibri" w:hAnsi="Calibri" w:eastAsia="Calibri" w:cs=""/>
+                <w:kern w:val="0"/>
+                <w:sz w:val="22"/>
+                <w:szCs w:val="22"/>
+                <w:lang w:val="ru-RU" w:eastAsia="en-US" w:bidi="ar-SA"/>
+              </w:rPr>
+            </w:pPr>
+            <w:r>
+              <w:rPr>
+                <w:rFonts w:eastAsia="Calibri" w:cs=""/>
+                <w:kern w:val="0"/>
+                <w:sz w:val="22"/>
+                <w:szCs w:val="22"/>
+                <w:lang w:val="ru-RU" w:eastAsia="en-US" w:bidi="ar-SA"/>
+              </w:rPr>
+              <w:t>ПУСТО (Информация не из ЛК ЗК)</w:t>
             </w:r>
           </w:p>
         </w:tc>
@@ -5378,6 +5508,7 @@
             <w:pPr>
               <w:pStyle w:val="Normal"/>
               <w:widowControl/>
+              <w:suppressAutoHyphens w:val="true"/>
               <w:spacing w:lineRule="auto" w:line="240" w:before="0" w:after="0"/>
               <w:jc w:val="left"/>
               <w:rPr>
@@ -5409,6 +5540,7 @@
             <w:pPr>
               <w:pStyle w:val="Normal"/>
               <w:widowControl/>
+              <w:suppressAutoHyphens w:val="true"/>
               <w:spacing w:lineRule="auto" w:line="240" w:before="0" w:after="0"/>
               <w:jc w:val="left"/>
               <w:rPr>
@@ -5440,45 +5572,26 @@
             <w:pPr>
               <w:pStyle w:val="Normal"/>
               <w:widowControl/>
-              <w:spacing w:lineRule="auto" w:line="240" w:before="0" w:after="0"/>
-              <w:jc w:val="left"/>
-              <w:rPr>
-                <w:rFonts w:ascii="Calibri" w:hAnsi="Calibri" w:eastAsia="Calibri" w:cs=""/>
-                <w:kern w:val="0"/>
-                <w:sz w:val="22"/>
-                <w:szCs w:val="22"/>
-                <w:lang w:val="ru-RU" w:eastAsia="en-US" w:bidi="ar-SA"/>
-              </w:rPr>
-            </w:pPr>
-            <w:r>
-              <w:rPr>
-                <w:rFonts w:eastAsia="Calibri" w:cs=""/>
-                <w:kern w:val="0"/>
-                <w:sz w:val="22"/>
-                <w:szCs w:val="22"/>
-                <w:lang w:val="ru-RU" w:eastAsia="en-US" w:bidi="ar-SA"/>
-              </w:rPr>
-              <w:t>ПУСТО (</w:t>
-            </w:r>
-            <w:r>
-              <w:rPr>
-                <w:rFonts w:eastAsia="Calibri" w:cs=""/>
-                <w:kern w:val="0"/>
-                <w:sz w:val="22"/>
-                <w:szCs w:val="22"/>
-                <w:lang w:val="ru-RU" w:eastAsia="en-US" w:bidi="ar-SA"/>
-              </w:rPr>
-              <w:t>Информация не из ЛК ЗК</w:t>
-            </w:r>
-            <w:r>
-              <w:rPr>
-                <w:rFonts w:eastAsia="Calibri" w:cs=""/>
-                <w:kern w:val="0"/>
-                <w:sz w:val="22"/>
-                <w:szCs w:val="22"/>
-                <w:lang w:val="ru-RU" w:eastAsia="en-US" w:bidi="ar-SA"/>
-              </w:rPr>
-              <w:t>)</w:t>
+              <w:suppressAutoHyphens w:val="true"/>
+              <w:spacing w:lineRule="auto" w:line="240" w:before="0" w:after="0"/>
+              <w:jc w:val="left"/>
+              <w:rPr>
+                <w:rFonts w:ascii="Calibri" w:hAnsi="Calibri" w:eastAsia="Calibri" w:cs=""/>
+                <w:kern w:val="0"/>
+                <w:sz w:val="22"/>
+                <w:szCs w:val="22"/>
+                <w:lang w:val="ru-RU" w:eastAsia="en-US" w:bidi="ar-SA"/>
+              </w:rPr>
+            </w:pPr>
+            <w:r>
+              <w:rPr>
+                <w:rFonts w:eastAsia="Calibri" w:cs=""/>
+                <w:kern w:val="0"/>
+                <w:sz w:val="22"/>
+                <w:szCs w:val="22"/>
+                <w:lang w:val="ru-RU" w:eastAsia="en-US" w:bidi="ar-SA"/>
+              </w:rPr>
+              <w:t>ПУСТО (Информация не из ЛК ЗК)</w:t>
             </w:r>
           </w:p>
         </w:tc>
@@ -5494,6 +5607,7 @@
             <w:pPr>
               <w:pStyle w:val="Normal"/>
               <w:widowControl/>
+              <w:suppressAutoHyphens w:val="true"/>
               <w:spacing w:lineRule="auto" w:line="240" w:before="0" w:after="0"/>
               <w:jc w:val="left"/>
               <w:rPr>
@@ -5525,6 +5639,7 @@
             <w:pPr>
               <w:pStyle w:val="Normal"/>
               <w:widowControl/>
+              <w:suppressAutoHyphens w:val="true"/>
               <w:spacing w:lineRule="auto" w:line="240" w:before="0" w:after="0"/>
               <w:jc w:val="left"/>
               <w:rPr>
@@ -5556,45 +5671,26 @@
             <w:pPr>
               <w:pStyle w:val="Normal"/>
               <w:widowControl/>
-              <w:spacing w:lineRule="auto" w:line="240" w:before="0" w:after="0"/>
-              <w:jc w:val="left"/>
-              <w:rPr>
-                <w:rFonts w:ascii="Calibri" w:hAnsi="Calibri" w:eastAsia="Calibri" w:cs=""/>
-                <w:kern w:val="0"/>
-                <w:sz w:val="22"/>
-                <w:szCs w:val="22"/>
-                <w:lang w:val="ru-RU" w:eastAsia="en-US" w:bidi="ar-SA"/>
-              </w:rPr>
-            </w:pPr>
-            <w:r>
-              <w:rPr>
-                <w:rFonts w:eastAsia="Calibri" w:cs=""/>
-                <w:kern w:val="0"/>
-                <w:sz w:val="22"/>
-                <w:szCs w:val="22"/>
-                <w:lang w:val="ru-RU" w:eastAsia="en-US" w:bidi="ar-SA"/>
-              </w:rPr>
-              <w:t>ПУСТО (</w:t>
-            </w:r>
-            <w:r>
-              <w:rPr>
-                <w:rFonts w:eastAsia="Calibri" w:cs=""/>
-                <w:kern w:val="0"/>
-                <w:sz w:val="22"/>
-                <w:szCs w:val="22"/>
-                <w:lang w:val="ru-RU" w:eastAsia="en-US" w:bidi="ar-SA"/>
-              </w:rPr>
-              <w:t>Информация не из ЛК ЗК</w:t>
-            </w:r>
-            <w:r>
-              <w:rPr>
-                <w:rFonts w:eastAsia="Calibri" w:cs=""/>
-                <w:kern w:val="0"/>
-                <w:sz w:val="22"/>
-                <w:szCs w:val="22"/>
-                <w:lang w:val="ru-RU" w:eastAsia="en-US" w:bidi="ar-SA"/>
-              </w:rPr>
-              <w:t>)</w:t>
+              <w:suppressAutoHyphens w:val="true"/>
+              <w:spacing w:lineRule="auto" w:line="240" w:before="0" w:after="0"/>
+              <w:jc w:val="left"/>
+              <w:rPr>
+                <w:rFonts w:ascii="Calibri" w:hAnsi="Calibri" w:eastAsia="Calibri" w:cs=""/>
+                <w:kern w:val="0"/>
+                <w:sz w:val="22"/>
+                <w:szCs w:val="22"/>
+                <w:lang w:val="ru-RU" w:eastAsia="en-US" w:bidi="ar-SA"/>
+              </w:rPr>
+            </w:pPr>
+            <w:r>
+              <w:rPr>
+                <w:rFonts w:eastAsia="Calibri" w:cs=""/>
+                <w:kern w:val="0"/>
+                <w:sz w:val="22"/>
+                <w:szCs w:val="22"/>
+                <w:lang w:val="ru-RU" w:eastAsia="en-US" w:bidi="ar-SA"/>
+              </w:rPr>
+              <w:t>ПУСТО (Информация не из ЛК ЗК)</w:t>
             </w:r>
           </w:p>
         </w:tc>
@@ -5610,6 +5706,7 @@
             <w:pPr>
               <w:pStyle w:val="Normal"/>
               <w:widowControl/>
+              <w:suppressAutoHyphens w:val="true"/>
               <w:spacing w:lineRule="auto" w:line="240" w:before="0" w:after="0"/>
               <w:jc w:val="left"/>
               <w:rPr>
@@ -5641,6 +5738,7 @@
             <w:pPr>
               <w:pStyle w:val="Normal"/>
               <w:widowControl/>
+              <w:suppressAutoHyphens w:val="true"/>
               <w:spacing w:lineRule="auto" w:line="240" w:before="0" w:after="0"/>
               <w:jc w:val="left"/>
               <w:rPr>
@@ -5672,6 +5770,7 @@
             <w:pPr>
               <w:pStyle w:val="Normal"/>
               <w:widowControl/>
+              <w:suppressAutoHyphens w:val="true"/>
               <w:spacing w:lineRule="auto" w:line="240" w:before="0" w:after="0"/>
               <w:jc w:val="left"/>
               <w:rPr>
@@ -5706,6 +5805,7 @@
             <w:pPr>
               <w:pStyle w:val="Normal"/>
               <w:widowControl/>
+              <w:suppressAutoHyphens w:val="true"/>
               <w:spacing w:lineRule="auto" w:line="240" w:before="0" w:after="0"/>
               <w:jc w:val="left"/>
               <w:rPr>
@@ -5737,6 +5837,7 @@
             <w:pPr>
               <w:pStyle w:val="Normal"/>
               <w:widowControl/>
+              <w:suppressAutoHyphens w:val="true"/>
               <w:spacing w:lineRule="auto" w:line="240" w:before="0" w:after="0"/>
               <w:jc w:val="left"/>
               <w:rPr>
@@ -5768,6 +5869,7 @@
             <w:pPr>
               <w:pStyle w:val="Normal"/>
               <w:widowControl/>
+              <w:suppressAutoHyphens w:val="true"/>
               <w:spacing w:lineRule="auto" w:line="240" w:before="0" w:after="0"/>
               <w:jc w:val="left"/>
               <w:rPr>
@@ -5802,6 +5904,7 @@
             <w:pPr>
               <w:pStyle w:val="Normal"/>
               <w:widowControl/>
+              <w:suppressAutoHyphens w:val="true"/>
               <w:spacing w:lineRule="auto" w:line="240" w:before="0" w:after="0"/>
               <w:jc w:val="left"/>
               <w:rPr>
@@ -5833,6 +5936,7 @@
             <w:pPr>
               <w:pStyle w:val="Normal"/>
               <w:widowControl/>
+              <w:suppressAutoHyphens w:val="true"/>
               <w:spacing w:lineRule="auto" w:line="240" w:before="0" w:after="0"/>
               <w:jc w:val="left"/>
               <w:rPr>
@@ -5864,6 +5968,7 @@
             <w:pPr>
               <w:pStyle w:val="Normal"/>
               <w:widowControl/>
+              <w:suppressAutoHyphens w:val="true"/>
               <w:spacing w:lineRule="auto" w:line="240" w:before="0" w:after="0"/>
               <w:jc w:val="left"/>
               <w:rPr>
@@ -5898,6 +6003,7 @@
             <w:pPr>
               <w:pStyle w:val="Normal"/>
               <w:widowControl/>
+              <w:suppressAutoHyphens w:val="true"/>
               <w:spacing w:lineRule="auto" w:line="240" w:before="0" w:after="0"/>
               <w:jc w:val="left"/>
               <w:rPr>
@@ -5929,6 +6035,7 @@
             <w:pPr>
               <w:pStyle w:val="Normal"/>
               <w:widowControl/>
+              <w:suppressAutoHyphens w:val="true"/>
               <w:spacing w:lineRule="auto" w:line="240" w:before="0" w:after="0"/>
               <w:jc w:val="left"/>
               <w:rPr>
@@ -5960,45 +6067,26 @@
             <w:pPr>
               <w:pStyle w:val="Normal"/>
               <w:widowControl/>
-              <w:spacing w:lineRule="auto" w:line="240" w:before="0" w:after="0"/>
-              <w:jc w:val="left"/>
-              <w:rPr>
-                <w:rFonts w:ascii="Calibri" w:hAnsi="Calibri" w:eastAsia="Calibri" w:cs=""/>
-                <w:kern w:val="0"/>
-                <w:sz w:val="22"/>
-                <w:szCs w:val="22"/>
-                <w:lang w:val="ru-RU" w:eastAsia="en-US" w:bidi="ar-SA"/>
-              </w:rPr>
-            </w:pPr>
-            <w:r>
-              <w:rPr>
-                <w:rFonts w:eastAsia="Calibri" w:cs=""/>
-                <w:kern w:val="0"/>
-                <w:sz w:val="22"/>
-                <w:szCs w:val="22"/>
-                <w:lang w:val="ru-RU" w:eastAsia="en-US" w:bidi="ar-SA"/>
-              </w:rPr>
-              <w:t>ПОКА ПУСТО. (</w:t>
-            </w:r>
-            <w:r>
-              <w:rPr>
-                <w:rFonts w:eastAsia="Calibri" w:cs=""/>
-                <w:kern w:val="0"/>
-                <w:sz w:val="22"/>
-                <w:szCs w:val="22"/>
-                <w:lang w:val="ru-RU" w:eastAsia="en-US" w:bidi="ar-SA"/>
-              </w:rPr>
-              <w:t>Номер РУПа. В ЛК ЗК мы не видим данную информацию, но в Атомарной нагрузке есть столбец РУП. Если строка нагрузки –это поток групп из разных РУПов, то РУПы необходимо перечислить через запятую.</w:t>
-            </w:r>
-            <w:r>
-              <w:rPr>
-                <w:rFonts w:eastAsia="Calibri" w:cs=""/>
-                <w:kern w:val="0"/>
-                <w:sz w:val="22"/>
-                <w:szCs w:val="22"/>
-                <w:lang w:val="ru-RU" w:eastAsia="en-US" w:bidi="ar-SA"/>
-              </w:rPr>
-              <w:t>)</w:t>
+              <w:suppressAutoHyphens w:val="true"/>
+              <w:spacing w:lineRule="auto" w:line="240" w:before="0" w:after="0"/>
+              <w:jc w:val="left"/>
+              <w:rPr>
+                <w:rFonts w:ascii="Calibri" w:hAnsi="Calibri" w:eastAsia="Calibri" w:cs=""/>
+                <w:kern w:val="0"/>
+                <w:sz w:val="22"/>
+                <w:szCs w:val="22"/>
+                <w:lang w:val="ru-RU" w:eastAsia="en-US" w:bidi="ar-SA"/>
+              </w:rPr>
+            </w:pPr>
+            <w:r>
+              <w:rPr>
+                <w:rFonts w:eastAsia="Calibri" w:cs=""/>
+                <w:kern w:val="0"/>
+                <w:sz w:val="22"/>
+                <w:szCs w:val="22"/>
+                <w:lang w:val="ru-RU" w:eastAsia="en-US" w:bidi="ar-SA"/>
+              </w:rPr>
+              <w:t>ПОКА ПУСТО. (Номер РУПа. В ЛК ЗК мы не видим данную информацию, но в Атомарной нагрузке есть столбец РУП. Если строка нагрузки –это поток групп из разных РУПов, то РУПы необходимо перечислить через запятую.)</w:t>
             </w:r>
           </w:p>
         </w:tc>
@@ -6020,7 +6108,13 @@
       </w:pPr>
       <w:r>
         <w:rPr/>
-        <w:t>37. Руководство аспирантом.</w:t>
+        <w:t xml:space="preserve">37. Руководство аспирантом. </w:t>
+      </w:r>
+      <w:r>
+        <w:rPr>
+          <w:lang w:val="en-US"/>
+        </w:rPr>
+        <w:t>aspirantura_ruk_asp</w:t>
       </w:r>
     </w:p>
     <w:p>
@@ -6076,7 +6170,15 @@
       </w:pPr>
       <w:r>
         <w:rPr/>
-        <w:t>Строка с непустым значением этого столбца заполняется из расчета на одного преподавателя-</w:t>
+        <w:t xml:space="preserve">Строка с непустым значением этого столбца </w:t>
+      </w:r>
+      <w:r>
+        <w:rPr/>
+        <w:t>(столбец 37, значение = 75)</w:t>
+      </w:r>
+      <w:r>
+        <w:rPr/>
+        <w:t xml:space="preserve"> заполняется из расчета на одного преподавателя-</w:t>
       </w:r>
       <w:r>
         <w:rPr>
@@ -6356,7 +6458,13 @@
       </w:pPr>
       <w:r>
         <w:rPr/>
-        <w:t>38. Руководство соискателем</w:t>
+        <w:t xml:space="preserve">38. Руководство соискателем. </w:t>
+      </w:r>
+      <w:r>
+        <w:rPr>
+          <w:lang w:val="en-US"/>
+        </w:rPr>
+        <w:t>aspirantura_ruk_soisk</w:t>
       </w:r>
     </w:p>
     <w:p>
@@ -6412,7 +6520,35 @@
       </w:pPr>
       <w:r>
         <w:rPr/>
-        <w:t>Строка с непустым значением этого столбца заполняется из расчета на одного преподавателя-</w:t>
+        <w:t>Строка с непустым значением этого столбца</w:t>
+      </w:r>
+      <w:r>
+        <w:rPr>
+          <w:lang w:val="en-US"/>
+        </w:rPr>
+        <w:t xml:space="preserve"> </w:t>
+      </w:r>
+      <w:r>
+        <w:rPr>
+          <w:lang w:val="en-US"/>
+        </w:rPr>
+        <w:t>(</w:t>
+      </w:r>
+      <w:r>
+        <w:rPr>
+          <w:lang w:val="ru-RU"/>
+        </w:rPr>
+        <w:t>столбец 37, значение 50)</w:t>
+      </w:r>
+      <w:r>
+        <w:rPr>
+          <w:lang w:val="en-US"/>
+        </w:rPr>
+        <w:t xml:space="preserve"> </w:t>
+      </w:r>
+      <w:r>
+        <w:rPr/>
+        <w:t>заполняется из расчета на одного преподавателя-</w:t>
       </w:r>
       <w:r>
         <w:rPr>
@@ -6578,17 +6714,65 @@
       </w:pPr>
       <w:r>
         <w:rPr/>
-        <w:t>39.ИК</w:t>
+        <w:t xml:space="preserve">39. ИК, </w:t>
+      </w:r>
+      <w:r>
+        <w:rPr/>
+        <w:t xml:space="preserve">таблица </w:t>
+      </w:r>
+      <w:r>
+        <w:rPr>
+          <w:lang w:val="en-US"/>
+        </w:rPr>
+        <w:t>ksro</w:t>
       </w:r>
     </w:p>
     <w:p>
       <w:pPr>
         <w:pStyle w:val="Normal"/>
-        <w:rPr/>
+        <w:rPr>
+          <w:lang w:val="ru-RU"/>
+        </w:rPr>
       </w:pPr>
       <w:r>
-        <w:rPr/>
-        <w:t>40.КСРО</w:t>
+        <w:rPr>
+          <w:lang w:val="en-US"/>
+        </w:rPr>
+        <w:t>Учитываем значения $_ksro_kind_uid = '26003.281474976710751'; $_ksro_discipline_uid = '26006.281474976727808'; $_ik_kind_uid = '26003.281474976710750'; $_ik_discipline_uid = '26006.281474976727807';</w:t>
+      </w:r>
+    </w:p>
+    <w:p>
+      <w:pPr>
+        <w:pStyle w:val="Normal"/>
+        <w:rPr/>
+      </w:pPr>
+      <w:r>
+        <w:rPr/>
+        <w:t xml:space="preserve">40. КСРО, </w:t>
+      </w:r>
+      <w:r>
+        <w:rPr/>
+        <w:t xml:space="preserve">таблица </w:t>
+      </w:r>
+      <w:r>
+        <w:rPr>
+          <w:lang w:val="en-US"/>
+        </w:rPr>
+        <w:t>ksro</w:t>
+      </w:r>
+    </w:p>
+    <w:p>
+      <w:pPr>
+        <w:pStyle w:val="Normal"/>
+        <w:rPr>
+          <w:lang w:val="ru-RU"/>
+        </w:rPr>
+      </w:pPr>
+      <w:r>
+        <w:rPr>
+          <w:lang w:val="ru-RU"/>
+        </w:rPr>
+        <w:t>Учитываем значения $_ksro_kind_uid = '26003.281474976710751'; $_ksro_discipline_uid = '26006.281474976727808'; $_ik_kind_uid = '26003.281474976710750'; $_ik_discipline_uid = '26006.281474976727807';</w:t>
       </w:r>
     </w:p>
     <w:p>
@@ -6664,7 +6848,7 @@
       </w:pPr>
       <w:r>
         <w:rPr/>
-        <w:t xml:space="preserve">  </w:t>
+        <w:t xml:space="preserve"> </w:t>
       </w:r>
       <w:r>
         <w:rPr/>
@@ -7387,6 +7571,7 @@
     <w:qFormat/>
     <w:pPr>
       <w:widowControl/>
+      <w:suppressAutoHyphens w:val="true"/>
       <w:bidi w:val="0"/>
       <w:spacing w:lineRule="auto" w:line="259" w:before="0" w:after="160"/>
       <w:jc w:val="left"/>

</xml_diff>